<commit_message>
docs: add team name (Algorists), team-project note and team-leader role to Week 1-4 reports
</commit_message>
<xml_diff>
--- a/docs/Week-1-Report.docx
+++ b/docs/Week-1-Report.docx
@@ -423,18 +423,17 @@
             </w:pPr>
             <w:r>
               <w:rPr>
-                <w:rFonts w:hint="default"/>
-                <w:color w:val="0000FF"/>
-                <w:sz w:val="24"/>
-              </w:rPr>
-              <w:t>VeriCart AI:</w:t>
-            </w:r>
-            <w:r>
-              <w:rPr>
-                <w:rFonts w:hint="default"/>
-                <w:sz w:val="24"/>
-              </w:rPr>
-              <w:t xml:space="preserve"> An Intelligent Multi-LLM E-Commerce Platform for Trustworthy Online Shopping</w:t>
+                <w:sz w:val="24"/>
+              </w:rPr>
+              <w:t>VeriCart AI: An Intelligent Multi-LLM E-Commerce Platform for Trustworthy Online Shopping</w:t>
+            </w:r>
+          </w:p>
+          <w:p>
+            <w:r>
+              <w:rPr>
+                <w:sz w:val="24"/>
+              </w:rPr>
+              <w:t>Team Name: Algorists   |   Project Type: Team Project   |   My Role: Team Leader</w:t>
             </w:r>
           </w:p>
         </w:tc>
@@ -1133,7 +1132,7 @@
               <w:rPr>
                 <w:sz w:val="24"/>
               </w:rPr>
-              <w:t>Completed the entire Week 1 testing and security-hardening phase. Established a complete testing infrastructure for the backend (JUnit 5, Mockito, H2 in-memory database) and the frontend (Vitest, jsdom, Vue Test Utils). Externalized all hardcoded AI keys (DeepSeek, Kimi, Hunyuan) and the JWT secret to environment-variable placeholders. Wrote 10 backend test classes covering all core services plus an integration test, and 2 frontend component test files.</w:t>
+              <w:t>Completed the entire Week 1 testing and security-hardening phase. Established a complete testing infrastructure for the backend (JUnit 5, Mockito, H2 in-memory database) and the frontend (Vitest, jsdom, Vue Test Utils). Externalized all hardcoded AI keys (DeepSeek, Kimi, Hunyuan) and the JWT secret to environment-variable placeholders. Wrote 10 backend test classes covering all core services plus an integration test, and 2 frontend component test files. This is a team project (Team Algorists) and I served as the team leader — I coordinated the weekly work plan, reviewed my teammates' contributions and integrated the final deliverables.</w:t>
             </w:r>
           </w:p>
           <w:p/>

</xml_diff>